<commit_message>
feat: add overseas product recommendation tab
</commit_message>
<xml_diff>
--- a/docs/01_요구사항정의서_화면설계서_추적성매트릭스.docx
+++ b/docs/01_요구사항정의서_화면설계서_추적성매트릭스.docx
@@ -2273,6 +2273,68 @@
           </w:p>
         </w:tc>
       </w:tr>
+      <w:tr>
+        <w:tc>
+          <w:tcPr>
+            <w:tcW w:type="dxa" w:w="1100"/>
+          </w:tcPr>
+          <w:p>
+            <w:r>
+              <w:t>REQ-F-015</w:t>
+            </w:r>
+          </w:p>
+        </w:tc>
+        <w:tc>
+          <w:tcPr>
+            <w:tcW w:type="dxa" w:w="1600"/>
+          </w:tcPr>
+          <w:p>
+            <w:r>
+              <w:t>해외 동일 성분 제품 조회</w:t>
+            </w:r>
+          </w:p>
+        </w:tc>
+        <w:tc>
+          <w:tcPr>
+            <w:tcW w:type="dxa" w:w="3600"/>
+          </w:tcPr>
+          <w:p>
+            <w:r>
+              <w:t>현재 조회 중인 약과 주성분이 같은 미국 유통 제품을 상세 화면 별도 탭에서 조회한다. ATC 기반 영문 성분명 해석과 기존 성분 매핑을 순차적으로 사용한다.</w:t>
+            </w:r>
+          </w:p>
+        </w:tc>
+        <w:tc>
+          <w:tcPr>
+            <w:tcW w:type="dxa" w:w="900"/>
+          </w:tcPr>
+          <w:p>
+            <w:r>
+              <w:t>중</w:t>
+            </w:r>
+          </w:p>
+        </w:tc>
+        <w:tc>
+          <w:tcPr>
+            <w:tcW w:type="dxa" w:w="900"/>
+          </w:tcPr>
+          <w:p>
+            <w:r>
+              <w:t>중</w:t>
+            </w:r>
+          </w:p>
+        </w:tc>
+        <w:tc>
+          <w:tcPr>
+            <w:tcW w:type="dxa" w:w="2366"/>
+          </w:tcPr>
+          <w:p>
+            <w:r>
+              <w:t>SCR-DETAIL-001</w:t>
+            </w:r>
+          </w:p>
+        </w:tc>
+      </w:tr>
     </w:tbl>
     <w:p>
       <w:r>
@@ -3058,18 +3120,8 @@
             <w:vAlign w:val="center"/>
           </w:tcPr>
           <w:p>
-            <w:pPr>
-              <w:jc w:val="left"/>
-            </w:pPr>
-            <w:r>
-              <w:rPr>
-                <w:rFonts w:ascii="맑은 고딕" w:cs="맑은 고딕" w:eastAsia="맑은 고딕" w:hAnsi="맑은 고딕"/>
-                <w:b w:val="false"/>
-                <w:bCs w:val="false"/>
-                <w:sz w:val="18"/>
-                <w:szCs w:val="18"/>
-              </w:rPr>
-              <w:t xml:space="preserve">국내 제품명·해외 성분명(영문) 매핑 실패 시 “정보 없음” 처리 및 로그를 기록한다.</w:t>
+            <w:r>
+              <w:t>국내 제품의 영문 성분명은 ingredient_en, WHO ATC 코드, 한글 성분 사전 순으로 해석한다. 모두 실패하면 해당 탭만 정보 없음 처리하고 로그를 기록한다.</w:t>
             </w:r>
           </w:p>
         </w:tc>
@@ -5989,15 +6041,7 @@
         <w:spacing w:after="150"/>
       </w:pPr>
       <w:r>
-        <w:rPr>
-          <w:rFonts w:ascii="맑은 고딕" w:cs="맑은 고딕" w:eastAsia="맑은 고딕" w:hAnsi="맑은 고딕"/>
-          <w:i/>
-          <w:iCs/>
-          <w:color w:val="595959"/>
-          <w:sz w:val="18"/>
-          <w:szCs w:val="18"/>
-        </w:rPr>
-        <w:t xml:space="preserve">관련 요구사항: REQ-F-006, REQ-F-007, REQ-F-008, REQ-F-009, REQ-F-010, REQ-N-001, REQ-N-003, REQ-N-004, REQ-N-007</w:t>
+        <w:t>관련 요구사항: REQ-F-006, REQ-F-007, REQ-F-008, REQ-F-009, REQ-F-010, REQ-F-015, REQ-N-001, REQ-N-003, REQ-N-004, REQ-N-005, REQ-N-007</w:t>
       </w:r>
     </w:p>
     <w:tbl>
@@ -6569,18 +6613,8 @@
             <w:vAlign w:val="center"/>
           </w:tcPr>
           <w:p>
-            <w:pPr>
-              <w:jc w:val="left"/>
-            </w:pPr>
-            <w:r>
-              <w:rPr>
-                <w:rFonts w:ascii="맑은 고딕" w:cs="맑은 고딕" w:eastAsia="맑은 고딕" w:hAnsi="맑은 고딕"/>
-                <w:b w:val="false"/>
-                <w:bCs w:val="false"/>
-                <w:sz w:val="18"/>
-                <w:szCs w:val="18"/>
-              </w:rPr>
-              <w:t xml:space="preserve">선택된 탭 내용만 표시 / 모바일에서 4탭이 한 줄에 안 들어가면 가로 스크롤</w:t>
+            <w:r>
+              <w:t>선택된 탭 내용만 표시 / 모바일에서 5탭이 한 줄에 안 들어가면 가로 스크롤</w:t>
             </w:r>
           </w:p>
         </w:tc>
@@ -7139,6 +7173,58 @@
                 <w:szCs w:val="18"/>
               </w:rPr>
               <w:t xml:space="preserve">결과없음: “확인된 병용금기 정보가 없습니다” / 실패: “현재 병용금기 정보를 불러올 수 없습니다”+재시도 / 금기=빨강 배지, 주의=주황 배지</w:t>
+            </w:r>
+          </w:p>
+        </w:tc>
+      </w:tr>
+      <w:tr>
+        <w:tc>
+          <w:tcPr>
+            <w:tcW w:type="dxa" w:w="600"/>
+          </w:tcPr>
+          <w:p>
+            <w:r>
+              <w:t>8</w:t>
+            </w:r>
+          </w:p>
+        </w:tc>
+        <w:tc>
+          <w:tcPr>
+            <w:tcW w:type="dxa" w:w="1800"/>
+          </w:tcPr>
+          <w:p>
+            <w:r>
+              <w:t>⑤ 해외에서는 이런 약 탭</w:t>
+            </w:r>
+          </w:p>
+        </w:tc>
+        <w:tc>
+          <w:tcPr>
+            <w:tcW w:type="dxa" w:w="2600"/>
+          </w:tcPr>
+          <w:p>
+            <w:r>
+              <w:t>탭 최초 선택 전 미조회 상태</w:t>
+            </w:r>
+          </w:p>
+        </w:tc>
+        <w:tc>
+          <w:tcPr>
+            <w:tcW w:type="dxa" w:w="2600"/>
+          </w:tcPr>
+          <w:p>
+            <w:r>
+              <w:t>탭 클릭 시 해외 동일 성분 제품 조회 / 실패 시 재시도</w:t>
+            </w:r>
+          </w:p>
+        </w:tc>
+        <w:tc>
+          <w:tcPr>
+            <w:tcW w:type="dxa" w:w="2866"/>
+          </w:tcPr>
+          <w:p>
+            <w:r>
+              <w:t>GET /drugs/{id}/overseas-products lazy loading. 결과 없음은 안내 문구 표시, 장애는 재시도. 미국 유통 제품은 국내 제품과 성분·함량·제형·허가사항이 다를 수 있다는 고지 상시 노출</w:t>
             </w:r>
           </w:p>
         </w:tc>
@@ -12900,6 +12986,78 @@
               </w:rPr>
               <w:t xml:space="preserve">●</w:t>
             </w:r>
+          </w:p>
+        </w:tc>
+      </w:tr>
+      <w:tr>
+        <w:tc>
+          <w:tcPr>
+            <w:tcW w:type="dxa" w:w="1400"/>
+          </w:tcPr>
+          <w:p>
+            <w:r>
+              <w:t>REQ-F-015</w:t>
+            </w:r>
+          </w:p>
+        </w:tc>
+        <w:tc>
+          <w:tcPr>
+            <w:tcW w:type="dxa" w:w="2200"/>
+          </w:tcPr>
+          <w:p>
+            <w:r>
+              <w:t>해외 동일 성분 제품 조회</w:t>
+            </w:r>
+          </w:p>
+        </w:tc>
+        <w:tc>
+          <w:tcPr>
+            <w:tcW w:type="dxa" w:w="1144"/>
+          </w:tcPr>
+          <w:p>
+            <w:r/>
+          </w:p>
+        </w:tc>
+        <w:tc>
+          <w:tcPr>
+            <w:tcW w:type="dxa" w:w="1144"/>
+          </w:tcPr>
+          <w:p>
+            <w:r/>
+          </w:p>
+        </w:tc>
+        <w:tc>
+          <w:tcPr>
+            <w:tcW w:type="dxa" w:w="1144"/>
+          </w:tcPr>
+          <w:p>
+            <w:r/>
+          </w:p>
+        </w:tc>
+        <w:tc>
+          <w:tcPr>
+            <w:tcW w:type="dxa" w:w="1144"/>
+          </w:tcPr>
+          <w:p>
+            <w:r>
+              <w:t>●</w:t>
+            </w:r>
+          </w:p>
+        </w:tc>
+        <w:tc>
+          <w:tcPr>
+            <w:tcW w:type="dxa" w:w="1144"/>
+          </w:tcPr>
+          <w:p>
+            <w:r/>
+          </w:p>
+        </w:tc>
+        <w:tc>
+          <w:tcPr>
+            <w:tcW w:type="dxa" w:w="1146"/>
+          </w:tcPr>
+          <w:p>
+            <w:r/>
           </w:p>
         </w:tc>
       </w:tr>

</xml_diff>